<commit_message>
Add EC2 deploy and backend log commands to the tech stack notes.
Co-authored-by: Cursor <cursoragent@cursor.com>
</commit_message>
<xml_diff>
--- a/knowledge/The Tech Stack.docx
+++ b/knowledge/The Tech Stack.docx
@@ -4,6 +4,57 @@
   <w:body>
     <w:p>
       <w:pPr>
+        <w:pStyle w:val="ListParagraph"/>
+        <w:numPr>
+          <w:ilvl w:val="0"/>
+          <w:numId w:val="2"/>
+        </w:numPr>
+      </w:pPr>
+      <w:r>
+        <w:t>Run this command in AWS Terminal that will copy code from github.</w:t>
+      </w:r>
+    </w:p>
+    <w:p>
+      <w:r>
+        <w:t xml:space="preserve"> </w:t>
+      </w:r>
+      <w:r>
+        <w:tab/>
+      </w:r>
+      <w:r>
+        <w:t>~/stockintel/deploy.sh</w:t>
+      </w:r>
+    </w:p>
+    <w:p>
+      <w:pPr>
+        <w:pStyle w:val="ListParagraph"/>
+        <w:numPr>
+          <w:ilvl w:val="0"/>
+          <w:numId w:val="2"/>
+        </w:numPr>
+      </w:pPr>
+      <w:r>
+        <w:t>Last 15 errors</w:t>
+      </w:r>
+    </w:p>
+    <w:p>
+      <w:pPr>
+        <w:ind w:firstLine="720"/>
+      </w:pPr>
+      <w:r>
+        <w:t>pm2 logs backend --err --lines 15</w:t>
+      </w:r>
+    </w:p>
+    <w:p>
+      <w:pPr>
+        <w:rPr>
+          <w:b/>
+          <w:bCs/>
+        </w:rPr>
+      </w:pPr>
+    </w:p>
+    <w:p>
+      <w:pPr>
         <w:rPr>
           <w:b/>
           <w:bCs/>
@@ -295,112 +346,6 @@
           <w:bCs/>
         </w:rPr>
         <w:t>Auth0 (Authentication)</w:t>
-      </w:r>
-    </w:p>
-    <w:p>
-      <w:r>
-        <w:rPr>
-          <w:b/>
-          <w:bCs/>
-        </w:rPr>
-        <w:t>What it is:</w:t>
-      </w:r>
-      <w:r>
-        <w:t xml:space="preserve"> Login management system.</w:t>
-      </w:r>
-      <w:r>
-        <w:br/>
-      </w:r>
-      <w:r>
-        <w:rPr>
-          <w:b/>
-          <w:bCs/>
-        </w:rPr>
-        <w:t>Role:</w:t>
-      </w:r>
-      <w:r>
-        <w:t xml:space="preserve"> Handles user registration, login, password reset, Google/Apple sign in.</w:t>
-      </w:r>
-      <w:r>
-        <w:br/>
-      </w:r>
-      <w:r>
-        <w:rPr>
-          <w:b/>
-          <w:bCs/>
-        </w:rPr>
-        <w:t>Analogy:</w:t>
-      </w:r>
-      <w:r>
-        <w:t xml:space="preserve"> Like a security guard at the door checking IDs.</w:t>
-      </w:r>
-    </w:p>
-    <w:p>
-      <w:pPr>
-        <w:rPr>
-          <w:b/>
-          <w:bCs/>
-        </w:rPr>
-      </w:pPr>
-      <w:r>
-        <w:rPr>
-          <w:b/>
-          <w:bCs/>
-        </w:rPr>
-        <w:t>Stripe (Payments)</w:t>
-      </w:r>
-    </w:p>
-    <w:p>
-      <w:r>
-        <w:rPr>
-          <w:b/>
-          <w:bCs/>
-        </w:rPr>
-        <w:t>What it is:</w:t>
-      </w:r>
-      <w:r>
-        <w:t xml:space="preserve"> Payment processing platform.</w:t>
-      </w:r>
-      <w:r>
-        <w:br/>
-      </w:r>
-      <w:r>
-        <w:rPr>
-          <w:b/>
-          <w:bCs/>
-        </w:rPr>
-        <w:t>Role:</w:t>
-      </w:r>
-      <w:r>
-        <w:t xml:space="preserve"> Handles subscription billing, credit cards, receipts securely.</w:t>
-      </w:r>
-      <w:r>
-        <w:br/>
-      </w:r>
-      <w:r>
-        <w:rPr>
-          <w:b/>
-          <w:bCs/>
-        </w:rPr>
-        <w:t>Analogy:</w:t>
-      </w:r>
-      <w:r>
-        <w:t xml:space="preserve"> Like a cashier who handles all money transactions.</w:t>
-      </w:r>
-    </w:p>
-    <w:p>
-      <w:pPr>
-        <w:rPr>
-          <w:b/>
-          <w:bCs/>
-        </w:rPr>
-      </w:pPr>
-      <w:r>
-        <w:rPr>
-          <w:b/>
-          <w:bCs/>
-        </w:rPr>
-        <w:t>SendGrid (Email)</w:t>
       </w:r>
     </w:p>
     <w:p>
@@ -413,6 +358,112 @@
         <w:t>What it is:</w:t>
       </w:r>
       <w:r>
+        <w:t xml:space="preserve"> Login management system.</w:t>
+      </w:r>
+      <w:r>
+        <w:br/>
+      </w:r>
+      <w:r>
+        <w:rPr>
+          <w:b/>
+          <w:bCs/>
+        </w:rPr>
+        <w:t>Role:</w:t>
+      </w:r>
+      <w:r>
+        <w:t xml:space="preserve"> Handles user registration, login, password reset, Google/Apple sign in.</w:t>
+      </w:r>
+      <w:r>
+        <w:br/>
+      </w:r>
+      <w:r>
+        <w:rPr>
+          <w:b/>
+          <w:bCs/>
+        </w:rPr>
+        <w:t>Analogy:</w:t>
+      </w:r>
+      <w:r>
+        <w:t xml:space="preserve"> Like a security guard at the door checking IDs.</w:t>
+      </w:r>
+    </w:p>
+    <w:p>
+      <w:pPr>
+        <w:rPr>
+          <w:b/>
+          <w:bCs/>
+        </w:rPr>
+      </w:pPr>
+      <w:r>
+        <w:rPr>
+          <w:b/>
+          <w:bCs/>
+        </w:rPr>
+        <w:t>Stripe (Payments)</w:t>
+      </w:r>
+    </w:p>
+    <w:p>
+      <w:r>
+        <w:rPr>
+          <w:b/>
+          <w:bCs/>
+        </w:rPr>
+        <w:t>What it is:</w:t>
+      </w:r>
+      <w:r>
+        <w:t xml:space="preserve"> Payment processing platform.</w:t>
+      </w:r>
+      <w:r>
+        <w:br/>
+      </w:r>
+      <w:r>
+        <w:rPr>
+          <w:b/>
+          <w:bCs/>
+        </w:rPr>
+        <w:t>Role:</w:t>
+      </w:r>
+      <w:r>
+        <w:t xml:space="preserve"> Handles subscription billing, credit cards, receipts securely.</w:t>
+      </w:r>
+      <w:r>
+        <w:br/>
+      </w:r>
+      <w:r>
+        <w:rPr>
+          <w:b/>
+          <w:bCs/>
+        </w:rPr>
+        <w:t>Analogy:</w:t>
+      </w:r>
+      <w:r>
+        <w:t xml:space="preserve"> Like a cashier who handles all money transactions.</w:t>
+      </w:r>
+    </w:p>
+    <w:p>
+      <w:pPr>
+        <w:rPr>
+          <w:b/>
+          <w:bCs/>
+        </w:rPr>
+      </w:pPr>
+      <w:r>
+        <w:rPr>
+          <w:b/>
+          <w:bCs/>
+        </w:rPr>
+        <w:t>SendGrid (Email)</w:t>
+      </w:r>
+    </w:p>
+    <w:p>
+      <w:r>
+        <w:rPr>
+          <w:b/>
+          <w:bCs/>
+        </w:rPr>
+        <w:t>What it is:</w:t>
+      </w:r>
+      <w:r>
         <w:t xml:space="preserve"> Email delivery platform.</w:t>
       </w:r>
       <w:r>
@@ -445,7 +496,7 @@
     <w:p>
       <w:r>
         <w:pict w14:anchorId="1FAD6514">
-          <v:rect id="_x0000_i1055" style="width:0;height:1.5pt" o:hralign="center" o:hrstd="t" o:hr="t" fillcolor="#a0a0a0" stroked="f"/>
+          <v:rect id="_x0000_i1025" style="width:0;height:1.5pt" o:hralign="center" o:hrstd="t" o:hr="t" fillcolor="#a0a0a0" stroked="f"/>
         </w:pict>
       </w:r>
     </w:p>
@@ -537,7 +588,7 @@
     <w:p>
       <w:r>
         <w:pict w14:anchorId="5A0B65C3">
-          <v:rect id="_x0000_i1056" style="width:0;height:1.5pt" o:hralign="center" o:hrstd="t" o:hr="t" fillcolor="#a0a0a0" stroked="f"/>
+          <v:rect id="_x0000_i1026" style="width:0;height:1.5pt" o:hralign="center" o:hrstd="t" o:hr="t" fillcolor="#a0a0a0" stroked="f"/>
         </w:pict>
       </w:r>
     </w:p>
@@ -553,6 +604,7 @@
           <w:b/>
           <w:bCs/>
         </w:rPr>
+        <w:lastRenderedPageBreak/>
         <w:t>How GitHub Connects Everything</w:t>
       </w:r>
     </w:p>
@@ -588,7 +640,6 @@
     </w:p>
     <w:p>
       <w:r>
-        <w:lastRenderedPageBreak/>
         <w:t>So the flow is always:</w:t>
       </w:r>
       <w:r>
@@ -605,7 +656,7 @@
     <w:p>
       <w:r>
         <w:pict w14:anchorId="024BDE35">
-          <v:rect id="_x0000_i1057" style="width:0;height:1.5pt" o:hralign="center" o:hrstd="t" o:hr="t" fillcolor="#a0a0a0" stroked="f"/>
+          <v:rect id="_x0000_i1027" style="width:0;height:1.5pt" o:hralign="center" o:hrstd="t" o:hr="t" fillcolor="#a0a0a0" stroked="f"/>
         </w:pict>
       </w:r>
     </w:p>
@@ -849,7 +900,7 @@
     <w:p>
       <w:r>
         <w:pict w14:anchorId="33984E1A">
-          <v:rect id="_x0000_i1058" style="width:0;height:1.5pt" o:hralign="center" o:hrstd="t" o:hr="t" fillcolor="#a0a0a0" stroked="f"/>
+          <v:rect id="_x0000_i1028" style="width:0;height:1.5pt" o:hralign="center" o:hrstd="t" o:hr="t" fillcolor="#a0a0a0" stroked="f"/>
         </w:pict>
       </w:r>
     </w:p>
@@ -910,6 +961,7 @@
     </w:p>
     <w:p>
       <w:r>
+        <w:lastRenderedPageBreak/>
         <w:t>8. Report sent back to frontend</w:t>
       </w:r>
     </w:p>
@@ -936,7 +988,7 @@
     <w:p>
       <w:r>
         <w:pict w14:anchorId="74F913C9">
-          <v:rect id="_x0000_i1059" style="width:0;height:1.5pt" o:hralign="center" o:hrstd="t" o:hr="t" fillcolor="#a0a0a0" stroked="f"/>
+          <v:rect id="_x0000_i1029" style="width:0;height:1.5pt" o:hralign="center" o:hrstd="t" o:hr="t" fillcolor="#a0a0a0" stroked="f"/>
         </w:pict>
       </w:r>
     </w:p>
@@ -967,7 +1019,6 @@
           <w:b/>
           <w:bCs/>
         </w:rPr>
-        <w:lastRenderedPageBreak/>
         <w:t>Next.js</w:t>
       </w:r>
       <w:r>
@@ -1298,8 +1349,97 @@
       </w:rPr>
     </w:lvl>
   </w:abstractNum>
+  <w:abstractNum w:abstractNumId="1" w15:restartNumberingAfterBreak="0">
+    <w:nsid w:val="66EC3EBD"/>
+    <w:multiLevelType w:val="hybridMultilevel"/>
+    <w:tmpl w:val="799A6CE4"/>
+    <w:lvl w:ilvl="0" w:tplc="1009000F">
+      <w:start w:val="1"/>
+      <w:numFmt w:val="decimal"/>
+      <w:lvlText w:val="%1."/>
+      <w:lvlJc w:val="left"/>
+      <w:pPr>
+        <w:ind w:left="720" w:hanging="360"/>
+      </w:pPr>
+    </w:lvl>
+    <w:lvl w:ilvl="1" w:tplc="10090019" w:tentative="1">
+      <w:start w:val="1"/>
+      <w:numFmt w:val="lowerLetter"/>
+      <w:lvlText w:val="%2."/>
+      <w:lvlJc w:val="left"/>
+      <w:pPr>
+        <w:ind w:left="1440" w:hanging="360"/>
+      </w:pPr>
+    </w:lvl>
+    <w:lvl w:ilvl="2" w:tplc="1009001B" w:tentative="1">
+      <w:start w:val="1"/>
+      <w:numFmt w:val="lowerRoman"/>
+      <w:lvlText w:val="%3."/>
+      <w:lvlJc w:val="right"/>
+      <w:pPr>
+        <w:ind w:left="2160" w:hanging="180"/>
+      </w:pPr>
+    </w:lvl>
+    <w:lvl w:ilvl="3" w:tplc="1009000F" w:tentative="1">
+      <w:start w:val="1"/>
+      <w:numFmt w:val="decimal"/>
+      <w:lvlText w:val="%4."/>
+      <w:lvlJc w:val="left"/>
+      <w:pPr>
+        <w:ind w:left="2880" w:hanging="360"/>
+      </w:pPr>
+    </w:lvl>
+    <w:lvl w:ilvl="4" w:tplc="10090019" w:tentative="1">
+      <w:start w:val="1"/>
+      <w:numFmt w:val="lowerLetter"/>
+      <w:lvlText w:val="%5."/>
+      <w:lvlJc w:val="left"/>
+      <w:pPr>
+        <w:ind w:left="3600" w:hanging="360"/>
+      </w:pPr>
+    </w:lvl>
+    <w:lvl w:ilvl="5" w:tplc="1009001B" w:tentative="1">
+      <w:start w:val="1"/>
+      <w:numFmt w:val="lowerRoman"/>
+      <w:lvlText w:val="%6."/>
+      <w:lvlJc w:val="right"/>
+      <w:pPr>
+        <w:ind w:left="4320" w:hanging="180"/>
+      </w:pPr>
+    </w:lvl>
+    <w:lvl w:ilvl="6" w:tplc="1009000F" w:tentative="1">
+      <w:start w:val="1"/>
+      <w:numFmt w:val="decimal"/>
+      <w:lvlText w:val="%7."/>
+      <w:lvlJc w:val="left"/>
+      <w:pPr>
+        <w:ind w:left="5040" w:hanging="360"/>
+      </w:pPr>
+    </w:lvl>
+    <w:lvl w:ilvl="7" w:tplc="10090019" w:tentative="1">
+      <w:start w:val="1"/>
+      <w:numFmt w:val="lowerLetter"/>
+      <w:lvlText w:val="%8."/>
+      <w:lvlJc w:val="left"/>
+      <w:pPr>
+        <w:ind w:left="5760" w:hanging="360"/>
+      </w:pPr>
+    </w:lvl>
+    <w:lvl w:ilvl="8" w:tplc="1009001B" w:tentative="1">
+      <w:start w:val="1"/>
+      <w:numFmt w:val="lowerRoman"/>
+      <w:lvlText w:val="%9."/>
+      <w:lvlJc w:val="right"/>
+      <w:pPr>
+        <w:ind w:left="6480" w:hanging="180"/>
+      </w:pPr>
+    </w:lvl>
+  </w:abstractNum>
   <w:num w:numId="1" w16cid:durableId="1944797988">
     <w:abstractNumId w:val="0"/>
+  </w:num>
+  <w:num w:numId="2" w16cid:durableId="1878200916">
+    <w:abstractNumId w:val="1"/>
   </w:num>
 </w:numbering>
 </file>
@@ -1907,6 +2047,7 @@
   <w:style w:type="character" w:default="1" w:styleId="DefaultParagraphFont">
     <w:name w:val="Default Paragraph Font"/>
     <w:uiPriority w:val="1"/>
+    <w:semiHidden/>
     <w:unhideWhenUsed/>
   </w:style>
   <w:style w:type="table" w:default="1" w:styleId="TableNormal">

</xml_diff>